<commit_message>
Refresh Wolf VO review doc — now all 65 situations / 564 lines
Add the "Tap a reel symbol — object jokes" group (wolf, buzzard, hard hats,
horseshoe, tornado, shot glass, royals, wild) to tools/wolf-vo-doc.cjs and
regenerate docs/Big_Bad_Wolf_Saloon_Wolf_Voiceover_Script.docx. Every pool is
now documented; no "Other" catch-all.

Co-Authored-By: Claude Opus 4.8 <noreply@anthropic.com>
</commit_message>
<xml_diff>
--- a/docs/Big_Bad_Wolf_Saloon_Wolf_Voiceover_Script.docx
+++ b/docs/Big_Bad_Wolf_Saloon_Wolf_Voiceover_Script.docx
@@ -50,7 +50,7 @@
           <w:sz w:val="18"/>
           <w:szCs w:val="18"/>
         </w:rPr>
-        <w:t xml:space="preserve">57 situations · 511 recorded lines · voice: “Callum-husky” (ElevenLabs)</w:t>
+        <w:t xml:space="preserve">65 situations · 564 recorded lines · voice: “Callum-husky” (ElevenLabs)</w:t>
       </w:r>
     </w:p>
     <w:p>
@@ -10119,7 +10119,7 @@
           <w:bCs/>
           <w:color w:val="1A3A1F"/>
         </w:rPr>
-        <w:t xml:space="preserve">Friendly roasts — DISABLED by default</w:t>
+        <w:t xml:space="preserve">Tap a reel symbol — object jokes</w:t>
       </w:r>
     </w:p>
     <w:p>
@@ -10135,7 +10135,7 @@
           <w:sz w:val="24"/>
           <w:szCs w:val="24"/>
         </w:rPr>
-        <w:t xml:space="preserve">Tongue-in-cheek nods to the “other” huff-and-puff game. OFF by default; enable only if you want them.</w:t>
+        <w:t xml:space="preserve">Tapping the Wolf symbol on the reels</w:t>
       </w:r>
       <w:r>
         <w:rPr>
@@ -10143,6 +10143,1113 @@
           <w:sz w:val="16"/>
           <w:szCs w:val="16"/>
         </w:rPr>
+        <w:t xml:space="preserve">   (clickWolf · 7)</w:t>
+      </w:r>
+    </w:p>
+    <w:p>
+      <w:pPr>
+        <w:pStyle w:val="ListParagraph"/>
+        <w:numPr>
+          <w:ilvl w:val="0"/>
+          <w:numId w:val="58"/>
+        </w:numPr>
+        <w:spacing w:after="20"/>
+      </w:pPr>
+      <w:r>
+        <w:rPr>
+          <w:sz w:val="22"/>
+          <w:szCs w:val="22"/>
+        </w:rPr>
+        <w:t xml:space="preserve">That handsome devil on the reel? Yeah, he gets it from me.</w:t>
+      </w:r>
+    </w:p>
+    <w:p>
+      <w:pPr>
+        <w:pStyle w:val="ListParagraph"/>
+        <w:numPr>
+          <w:ilvl w:val="0"/>
+          <w:numId w:val="58"/>
+        </w:numPr>
+        <w:spacing w:after="20"/>
+      </w:pPr>
+      <w:r>
+        <w:rPr>
+          <w:sz w:val="22"/>
+          <w:szCs w:val="22"/>
+        </w:rPr>
+        <w:t xml:space="preserve">Two wolves in one saloon? The pigs are officially doomed.</w:t>
+      </w:r>
+    </w:p>
+    <w:p>
+      <w:pPr>
+        <w:pStyle w:val="ListParagraph"/>
+        <w:numPr>
+          <w:ilvl w:val="0"/>
+          <w:numId w:val="58"/>
+        </w:numPr>
+        <w:spacing w:after="20"/>
+      </w:pPr>
+      <w:r>
+        <w:rPr>
+          <w:sz w:val="22"/>
+          <w:szCs w:val="22"/>
+        </w:rPr>
+        <w:t xml:space="preserve">Click me all ya want, partner. I don't break character.</w:t>
+      </w:r>
+    </w:p>
+    <w:p>
+      <w:pPr>
+        <w:pStyle w:val="ListParagraph"/>
+        <w:numPr>
+          <w:ilvl w:val="0"/>
+          <w:numId w:val="58"/>
+        </w:numPr>
+        <w:spacing w:after="20"/>
+      </w:pPr>
+      <w:r>
+        <w:rPr>
+          <w:sz w:val="22"/>
+          <w:szCs w:val="22"/>
+        </w:rPr>
+        <w:t xml:space="preserve">I'd recognize that snarl anywhere. It's my good side.</w:t>
+      </w:r>
+    </w:p>
+    <w:p>
+      <w:pPr>
+        <w:pStyle w:val="ListParagraph"/>
+        <w:numPr>
+          <w:ilvl w:val="0"/>
+          <w:numId w:val="58"/>
+        </w:numPr>
+        <w:spacing w:after="20"/>
+      </w:pPr>
+      <w:r>
+        <w:rPr>
+          <w:sz w:val="22"/>
+          <w:szCs w:val="22"/>
+        </w:rPr>
+        <w:t xml:space="preserve">That's my reel cousin. Still owes me twenty bucks.</w:t>
+      </w:r>
+    </w:p>
+    <w:p>
+      <w:pPr>
+        <w:pStyle w:val="ListParagraph"/>
+        <w:numPr>
+          <w:ilvl w:val="0"/>
+          <w:numId w:val="58"/>
+        </w:numPr>
+        <w:spacing w:after="20"/>
+      </w:pPr>
+      <w:r>
+        <w:rPr>
+          <w:sz w:val="22"/>
+          <w:szCs w:val="22"/>
+        </w:rPr>
+        <w:t xml:space="preserve">Careful pokin' the wolf. I bite back... affectionately.</w:t>
+      </w:r>
+    </w:p>
+    <w:p>
+      <w:pPr>
+        <w:pStyle w:val="ListParagraph"/>
+        <w:numPr>
+          <w:ilvl w:val="0"/>
+          <w:numId w:val="58"/>
+        </w:numPr>
+        <w:spacing w:after="20"/>
+      </w:pPr>
+      <w:r>
+        <w:rPr>
+          <w:sz w:val="22"/>
+          <w:szCs w:val="22"/>
+        </w:rPr>
+        <w:t xml:space="preserve">A wolf symbol. Finally, some good-lookin' competition.</w:t>
+      </w:r>
+    </w:p>
+    <w:p>
+      <w:pPr>
+        <w:pStyle w:val="Heading2"/>
+        <w:spacing w:after="40" w:before="160"/>
+      </w:pPr>
+      <w:r>
+        <w:rPr>
+          <w:b/>
+          <w:bCs/>
+          <w:color w:val="8A6D1A"/>
+          <w:sz w:val="24"/>
+          <w:szCs w:val="24"/>
+        </w:rPr>
+        <w:t xml:space="preserve">Tapping the Buzzard symbol</w:t>
+      </w:r>
+      <w:r>
+        <w:rPr>
+          <w:color w:val="666666"/>
+          <w:sz w:val="16"/>
+          <w:szCs w:val="16"/>
+        </w:rPr>
+        <w:t xml:space="preserve">   (clickBuzzard · 7)</w:t>
+      </w:r>
+    </w:p>
+    <w:p>
+      <w:pPr>
+        <w:pStyle w:val="ListParagraph"/>
+        <w:numPr>
+          <w:ilvl w:val="0"/>
+          <w:numId w:val="59"/>
+        </w:numPr>
+        <w:spacing w:after="20"/>
+      </w:pPr>
+      <w:r>
+        <w:rPr>
+          <w:sz w:val="22"/>
+          <w:szCs w:val="22"/>
+        </w:rPr>
+        <w:t xml:space="preserve">That buzzard shows up when somethin's about to die. Usually a straw house.</w:t>
+      </w:r>
+    </w:p>
+    <w:p>
+      <w:pPr>
+        <w:pStyle w:val="ListParagraph"/>
+        <w:numPr>
+          <w:ilvl w:val="0"/>
+          <w:numId w:val="59"/>
+        </w:numPr>
+        <w:spacing w:after="20"/>
+      </w:pPr>
+      <w:r>
+        <w:rPr>
+          <w:sz w:val="22"/>
+          <w:szCs w:val="22"/>
+        </w:rPr>
+        <w:t xml:space="preserve">Ol' buzzard's just waitin' for the pigs to slip up. Patient fella.</w:t>
+      </w:r>
+    </w:p>
+    <w:p>
+      <w:pPr>
+        <w:pStyle w:val="ListParagraph"/>
+        <w:numPr>
+          <w:ilvl w:val="0"/>
+          <w:numId w:val="59"/>
+        </w:numPr>
+        <w:spacing w:after="20"/>
+      </w:pPr>
+      <w:r>
+        <w:rPr>
+          <w:sz w:val="22"/>
+          <w:szCs w:val="22"/>
+        </w:rPr>
+        <w:t xml:space="preserve">That bird's got worse manners than me, and that's sayin' somethin'.</w:t>
+      </w:r>
+    </w:p>
+    <w:p>
+      <w:pPr>
+        <w:pStyle w:val="ListParagraph"/>
+        <w:numPr>
+          <w:ilvl w:val="0"/>
+          <w:numId w:val="59"/>
+        </w:numPr>
+        <w:spacing w:after="20"/>
+      </w:pPr>
+      <w:r>
+        <w:rPr>
+          <w:sz w:val="22"/>
+          <w:szCs w:val="22"/>
+        </w:rPr>
+        <w:t xml:space="preserve">Buzzard pays the least 'cause he eats the leftovers. Even the reels know it.</w:t>
+      </w:r>
+    </w:p>
+    <w:p>
+      <w:pPr>
+        <w:pStyle w:val="ListParagraph"/>
+        <w:numPr>
+          <w:ilvl w:val="0"/>
+          <w:numId w:val="59"/>
+        </w:numPr>
+        <w:spacing w:after="20"/>
+      </w:pPr>
+      <w:r>
+        <w:rPr>
+          <w:sz w:val="22"/>
+          <w:szCs w:val="22"/>
+        </w:rPr>
+        <w:t xml:space="preserve">A buzzard. Circlin', circlin'... cheap date, though.</w:t>
+      </w:r>
+    </w:p>
+    <w:p>
+      <w:pPr>
+        <w:pStyle w:val="ListParagraph"/>
+        <w:numPr>
+          <w:ilvl w:val="0"/>
+          <w:numId w:val="59"/>
+        </w:numPr>
+        <w:spacing w:after="20"/>
+      </w:pPr>
+      <w:r>
+        <w:rPr>
+          <w:sz w:val="22"/>
+          <w:szCs w:val="22"/>
+        </w:rPr>
+        <w:t xml:space="preserve">That buzzard once tried to outwait a wolf. Lost. Badly.</w:t>
+      </w:r>
+    </w:p>
+    <w:p>
+      <w:pPr>
+        <w:pStyle w:val="ListParagraph"/>
+        <w:numPr>
+          <w:ilvl w:val="0"/>
+          <w:numId w:val="59"/>
+        </w:numPr>
+        <w:spacing w:after="20"/>
+      </w:pPr>
+      <w:r>
+        <w:rPr>
+          <w:sz w:val="22"/>
+          <w:szCs w:val="22"/>
+        </w:rPr>
+        <w:t xml:space="preserve">Don't mind the buzzard. He's just here for the scraps.</w:t>
+      </w:r>
+    </w:p>
+    <w:p>
+      <w:pPr>
+        <w:pStyle w:val="Heading2"/>
+        <w:spacing w:after="40" w:before="160"/>
+      </w:pPr>
+      <w:r>
+        <w:rPr>
+          <w:b/>
+          <w:bCs/>
+          <w:color w:val="8A6D1A"/>
+          <w:sz w:val="24"/>
+          <w:szCs w:val="24"/>
+        </w:rPr>
+        <w:t xml:space="preserve">Tapping a Hard Hat symbol</w:t>
+      </w:r>
+      <w:r>
+        <w:rPr>
+          <w:color w:val="666666"/>
+          <w:sz w:val="16"/>
+          <w:szCs w:val="16"/>
+        </w:rPr>
+        <w:t xml:space="preserve">   (clickHat · 7)</w:t>
+      </w:r>
+    </w:p>
+    <w:p>
+      <w:pPr>
+        <w:pStyle w:val="ListParagraph"/>
+        <w:numPr>
+          <w:ilvl w:val="0"/>
+          <w:numId w:val="60"/>
+        </w:numPr>
+        <w:spacing w:after="20"/>
+      </w:pPr>
+      <w:r>
+        <w:rPr>
+          <w:sz w:val="22"/>
+          <w:szCs w:val="22"/>
+        </w:rPr>
+        <w:t xml:space="preserve">Hard hat! Six of them little helmets and we kick the bonus doors open.</w:t>
+      </w:r>
+    </w:p>
+    <w:p>
+      <w:pPr>
+        <w:pStyle w:val="ListParagraph"/>
+        <w:numPr>
+          <w:ilvl w:val="0"/>
+          <w:numId w:val="60"/>
+        </w:numPr>
+        <w:spacing w:after="20"/>
+      </w:pPr>
+      <w:r>
+        <w:rPr>
+          <w:sz w:val="22"/>
+          <w:szCs w:val="22"/>
+        </w:rPr>
+        <w:t xml:space="preserve">Pigs wear hard hats thinkin' they'll save the house. Adorable.</w:t>
+      </w:r>
+    </w:p>
+    <w:p>
+      <w:pPr>
+        <w:pStyle w:val="ListParagraph"/>
+        <w:numPr>
+          <w:ilvl w:val="0"/>
+          <w:numId w:val="60"/>
+        </w:numPr>
+        <w:spacing w:after="20"/>
+      </w:pPr>
+      <w:r>
+        <w:rPr>
+          <w:sz w:val="22"/>
+          <w:szCs w:val="22"/>
+        </w:rPr>
+        <w:t xml:space="preserve">A hard hat. Safety first... right before I huff the whole thing down.</w:t>
+      </w:r>
+    </w:p>
+    <w:p>
+      <w:pPr>
+        <w:pStyle w:val="ListParagraph"/>
+        <w:numPr>
+          <w:ilvl w:val="0"/>
+          <w:numId w:val="60"/>
+        </w:numPr>
+        <w:spacing w:after="20"/>
+      </w:pPr>
+      <w:r>
+        <w:rPr>
+          <w:sz w:val="22"/>
+          <w:szCs w:val="22"/>
+        </w:rPr>
+        <w:t xml:space="preserve">Them pigs unionized. Now they got hard hats AND a mortgage.</w:t>
+      </w:r>
+    </w:p>
+    <w:p>
+      <w:pPr>
+        <w:pStyle w:val="ListParagraph"/>
+        <w:numPr>
+          <w:ilvl w:val="0"/>
+          <w:numId w:val="60"/>
+        </w:numPr>
+        <w:spacing w:after="20"/>
+      </w:pPr>
+      <w:r>
+        <w:rPr>
+          <w:sz w:val="22"/>
+          <w:szCs w:val="22"/>
+        </w:rPr>
+        <w:t xml:space="preserve">Collect six hard hats and the back room opens. I'll bring the lungs.</w:t>
+      </w:r>
+    </w:p>
+    <w:p>
+      <w:pPr>
+        <w:pStyle w:val="ListParagraph"/>
+        <w:numPr>
+          <w:ilvl w:val="0"/>
+          <w:numId w:val="60"/>
+        </w:numPr>
+        <w:spacing w:after="20"/>
+      </w:pPr>
+      <w:r>
+        <w:rPr>
+          <w:sz w:val="22"/>
+          <w:szCs w:val="22"/>
+        </w:rPr>
+        <w:t xml:space="preserve">A hard hat won't stop a wolf. But it's cute that they try.</w:t>
+      </w:r>
+    </w:p>
+    <w:p>
+      <w:pPr>
+        <w:pStyle w:val="ListParagraph"/>
+        <w:numPr>
+          <w:ilvl w:val="0"/>
+          <w:numId w:val="60"/>
+        </w:numPr>
+        <w:spacing w:after="20"/>
+      </w:pPr>
+      <w:r>
+        <w:rPr>
+          <w:sz w:val="22"/>
+          <w:szCs w:val="22"/>
+        </w:rPr>
+        <w:t xml:space="preserve">Construction crew's clockin' in. Six hats and the real fun starts.</w:t>
+      </w:r>
+    </w:p>
+    <w:p>
+      <w:pPr>
+        <w:pStyle w:val="Heading2"/>
+        <w:spacing w:after="40" w:before="160"/>
+      </w:pPr>
+      <w:r>
+        <w:rPr>
+          <w:b/>
+          <w:bCs/>
+          <w:color w:val="8A6D1A"/>
+          <w:sz w:val="24"/>
+          <w:szCs w:val="24"/>
+        </w:rPr>
+        <w:t xml:space="preserve">Tapping the Horseshoe symbol</w:t>
+      </w:r>
+      <w:r>
+        <w:rPr>
+          <w:color w:val="666666"/>
+          <w:sz w:val="16"/>
+          <w:szCs w:val="16"/>
+        </w:rPr>
+        <w:t xml:space="preserve">   (clickHorseshoe · 7)</w:t>
+      </w:r>
+    </w:p>
+    <w:p>
+      <w:pPr>
+        <w:pStyle w:val="ListParagraph"/>
+        <w:numPr>
+          <w:ilvl w:val="0"/>
+          <w:numId w:val="61"/>
+        </w:numPr>
+        <w:spacing w:after="20"/>
+      </w:pPr>
+      <w:r>
+        <w:rPr>
+          <w:sz w:val="22"/>
+          <w:szCs w:val="22"/>
+        </w:rPr>
+        <w:t xml:space="preserve">Lucky horseshoe! Stole it off a nervous pony. Don't tell.</w:t>
+      </w:r>
+    </w:p>
+    <w:p>
+      <w:pPr>
+        <w:pStyle w:val="ListParagraph"/>
+        <w:numPr>
+          <w:ilvl w:val="0"/>
+          <w:numId w:val="61"/>
+        </w:numPr>
+        <w:spacing w:after="20"/>
+      </w:pPr>
+      <w:r>
+        <w:rPr>
+          <w:sz w:val="22"/>
+          <w:szCs w:val="22"/>
+        </w:rPr>
+        <w:t xml:space="preserve">That horseshoe's upside down. All the luck's pourin' out. Tragic.</w:t>
+      </w:r>
+    </w:p>
+    <w:p>
+      <w:pPr>
+        <w:pStyle w:val="ListParagraph"/>
+        <w:numPr>
+          <w:ilvl w:val="0"/>
+          <w:numId w:val="61"/>
+        </w:numPr>
+        <w:spacing w:after="20"/>
+      </w:pPr>
+      <w:r>
+        <w:rPr>
+          <w:sz w:val="22"/>
+          <w:szCs w:val="22"/>
+        </w:rPr>
+        <w:t xml:space="preserve">Hang a horseshoe over the saloon door, they say. I just hang the pigs.</w:t>
+      </w:r>
+    </w:p>
+    <w:p>
+      <w:pPr>
+        <w:pStyle w:val="ListParagraph"/>
+        <w:numPr>
+          <w:ilvl w:val="0"/>
+          <w:numId w:val="61"/>
+        </w:numPr>
+        <w:spacing w:after="20"/>
+      </w:pPr>
+      <w:r>
+        <w:rPr>
+          <w:sz w:val="22"/>
+          <w:szCs w:val="22"/>
+        </w:rPr>
+        <w:t xml:space="preserve">Found a horseshoe once. The horse weren't usin' it... anymore.</w:t>
+      </w:r>
+    </w:p>
+    <w:p>
+      <w:pPr>
+        <w:pStyle w:val="ListParagraph"/>
+        <w:numPr>
+          <w:ilvl w:val="0"/>
+          <w:numId w:val="61"/>
+        </w:numPr>
+        <w:spacing w:after="20"/>
+      </w:pPr>
+      <w:r>
+        <w:rPr>
+          <w:sz w:val="22"/>
+          <w:szCs w:val="22"/>
+        </w:rPr>
+        <w:t xml:space="preserve">Iron luck on the reels. Shinier than the sheriff's badge — which is mine.</w:t>
+      </w:r>
+    </w:p>
+    <w:p>
+      <w:pPr>
+        <w:pStyle w:val="ListParagraph"/>
+        <w:numPr>
+          <w:ilvl w:val="0"/>
+          <w:numId w:val="61"/>
+        </w:numPr>
+        <w:spacing w:after="20"/>
+      </w:pPr>
+      <w:r>
+        <w:rPr>
+          <w:sz w:val="22"/>
+          <w:szCs w:val="22"/>
+        </w:rPr>
+        <w:t xml:space="preserve">That horseshoe's seen more miles than my boots, and that's a lot.</w:t>
+      </w:r>
+    </w:p>
+    <w:p>
+      <w:pPr>
+        <w:pStyle w:val="ListParagraph"/>
+        <w:numPr>
+          <w:ilvl w:val="0"/>
+          <w:numId w:val="61"/>
+        </w:numPr>
+        <w:spacing w:after="20"/>
+      </w:pPr>
+      <w:r>
+        <w:rPr>
+          <w:sz w:val="22"/>
+          <w:szCs w:val="22"/>
+        </w:rPr>
+        <w:t xml:space="preserve">A horseshoe. Good luck for you, bad luck for the pigs.</w:t>
+      </w:r>
+    </w:p>
+    <w:p>
+      <w:pPr>
+        <w:pStyle w:val="Heading2"/>
+        <w:spacing w:after="40" w:before="160"/>
+      </w:pPr>
+      <w:r>
+        <w:rPr>
+          <w:b/>
+          <w:bCs/>
+          <w:color w:val="8A6D1A"/>
+          <w:sz w:val="24"/>
+          <w:szCs w:val="24"/>
+        </w:rPr>
+        <w:t xml:space="preserve">Tapping the Tornado symbol</w:t>
+      </w:r>
+      <w:r>
+        <w:rPr>
+          <w:color w:val="666666"/>
+          <w:sz w:val="16"/>
+          <w:szCs w:val="16"/>
+        </w:rPr>
+        <w:t xml:space="preserve">   (clickTornado · 7)</w:t>
+      </w:r>
+    </w:p>
+    <w:p>
+      <w:pPr>
+        <w:pStyle w:val="ListParagraph"/>
+        <w:numPr>
+          <w:ilvl w:val="0"/>
+          <w:numId w:val="62"/>
+        </w:numPr>
+        <w:spacing w:after="20"/>
+      </w:pPr>
+      <w:r>
+        <w:rPr>
+          <w:sz w:val="22"/>
+          <w:szCs w:val="22"/>
+        </w:rPr>
+        <w:t xml:space="preserve">A tornado! That's just me sneezin', partner. Allergies.</w:t>
+      </w:r>
+    </w:p>
+    <w:p>
+      <w:pPr>
+        <w:pStyle w:val="ListParagraph"/>
+        <w:numPr>
+          <w:ilvl w:val="0"/>
+          <w:numId w:val="62"/>
+        </w:numPr>
+        <w:spacing w:after="20"/>
+      </w:pPr>
+      <w:r>
+        <w:rPr>
+          <w:sz w:val="22"/>
+          <w:szCs w:val="22"/>
+        </w:rPr>
+        <w:t xml:space="preserve">Twister on the reels. I huffed a little too hard last Tuesday.</w:t>
+      </w:r>
+    </w:p>
+    <w:p>
+      <w:pPr>
+        <w:pStyle w:val="ListParagraph"/>
+        <w:numPr>
+          <w:ilvl w:val="0"/>
+          <w:numId w:val="62"/>
+        </w:numPr>
+        <w:spacing w:after="20"/>
+      </w:pPr>
+      <w:r>
+        <w:rPr>
+          <w:sz w:val="22"/>
+          <w:szCs w:val="22"/>
+        </w:rPr>
+        <w:t xml:space="preserve">That tornado took a straw house clean to the next county. Saved me the trip.</w:t>
+      </w:r>
+    </w:p>
+    <w:p>
+      <w:pPr>
+        <w:pStyle w:val="ListParagraph"/>
+        <w:numPr>
+          <w:ilvl w:val="0"/>
+          <w:numId w:val="62"/>
+        </w:numPr>
+        <w:spacing w:after="20"/>
+      </w:pPr>
+      <w:r>
+        <w:rPr>
+          <w:sz w:val="22"/>
+          <w:szCs w:val="22"/>
+        </w:rPr>
+        <w:t xml:space="preserve">Don't worry 'bout the tornado. It's on my payroll.</w:t>
+      </w:r>
+    </w:p>
+    <w:p>
+      <w:pPr>
+        <w:pStyle w:val="ListParagraph"/>
+        <w:numPr>
+          <w:ilvl w:val="0"/>
+          <w:numId w:val="62"/>
+        </w:numPr>
+        <w:spacing w:after="20"/>
+      </w:pPr>
+      <w:r>
+        <w:rPr>
+          <w:sz w:val="22"/>
+          <w:szCs w:val="22"/>
+        </w:rPr>
+        <w:t xml:space="preserve">Nature's way of doin' my job for me. I respect the hustle.</w:t>
+      </w:r>
+    </w:p>
+    <w:p>
+      <w:pPr>
+        <w:pStyle w:val="ListParagraph"/>
+        <w:numPr>
+          <w:ilvl w:val="0"/>
+          <w:numId w:val="62"/>
+        </w:numPr>
+        <w:spacing w:after="20"/>
+      </w:pPr>
+      <w:r>
+        <w:rPr>
+          <w:sz w:val="22"/>
+          <w:szCs w:val="22"/>
+        </w:rPr>
+        <w:t xml:space="preserve">Pigs see a tornado. I see a coworker.</w:t>
+      </w:r>
+    </w:p>
+    <w:p>
+      <w:pPr>
+        <w:pStyle w:val="ListParagraph"/>
+        <w:numPr>
+          <w:ilvl w:val="0"/>
+          <w:numId w:val="62"/>
+        </w:numPr>
+        <w:spacing w:after="20"/>
+      </w:pPr>
+      <w:r>
+        <w:rPr>
+          <w:sz w:val="22"/>
+          <w:szCs w:val="22"/>
+        </w:rPr>
+        <w:t xml:space="preserve">That's a lot of wind, partner. And I'm the windiest thing in this saloon.</w:t>
+      </w:r>
+    </w:p>
+    <w:p>
+      <w:pPr>
+        <w:pStyle w:val="Heading2"/>
+        <w:spacing w:after="40" w:before="160"/>
+      </w:pPr>
+      <w:r>
+        <w:rPr>
+          <w:b/>
+          <w:bCs/>
+          <w:color w:val="8A6D1A"/>
+          <w:sz w:val="24"/>
+          <w:szCs w:val="24"/>
+        </w:rPr>
+        <w:t xml:space="preserve">Tapping the Shot Glass symbol</w:t>
+      </w:r>
+      <w:r>
+        <w:rPr>
+          <w:color w:val="666666"/>
+          <w:sz w:val="16"/>
+          <w:szCs w:val="16"/>
+        </w:rPr>
+        <w:t xml:space="preserve">   (clickShotGlass · 7)</w:t>
+      </w:r>
+    </w:p>
+    <w:p>
+      <w:pPr>
+        <w:pStyle w:val="ListParagraph"/>
+        <w:numPr>
+          <w:ilvl w:val="0"/>
+          <w:numId w:val="63"/>
+        </w:numPr>
+        <w:spacing w:after="20"/>
+      </w:pPr>
+      <w:r>
+        <w:rPr>
+          <w:sz w:val="22"/>
+          <w:szCs w:val="22"/>
+        </w:rPr>
+        <w:t xml:space="preserve">Shot glass! Bartender, leave the bottle. The wolf's thirsty.</w:t>
+      </w:r>
+    </w:p>
+    <w:p>
+      <w:pPr>
+        <w:pStyle w:val="ListParagraph"/>
+        <w:numPr>
+          <w:ilvl w:val="0"/>
+          <w:numId w:val="63"/>
+        </w:numPr>
+        <w:spacing w:after="20"/>
+      </w:pPr>
+      <w:r>
+        <w:rPr>
+          <w:sz w:val="22"/>
+          <w:szCs w:val="22"/>
+        </w:rPr>
+        <w:t xml:space="preserve">A little glass with a big attitude. Reminds me of the smallest pig.</w:t>
+      </w:r>
+    </w:p>
+    <w:p>
+      <w:pPr>
+        <w:pStyle w:val="ListParagraph"/>
+        <w:numPr>
+          <w:ilvl w:val="0"/>
+          <w:numId w:val="63"/>
+        </w:numPr>
+        <w:spacing w:after="20"/>
+      </w:pPr>
+      <w:r>
+        <w:rPr>
+          <w:sz w:val="22"/>
+          <w:szCs w:val="22"/>
+        </w:rPr>
+        <w:t xml:space="preserve">One shot for courage, partner. Two for a bad decision.</w:t>
+      </w:r>
+    </w:p>
+    <w:p>
+      <w:pPr>
+        <w:pStyle w:val="ListParagraph"/>
+        <w:numPr>
+          <w:ilvl w:val="0"/>
+          <w:numId w:val="63"/>
+        </w:numPr>
+        <w:spacing w:after="20"/>
+      </w:pPr>
+      <w:r>
+        <w:rPr>
+          <w:sz w:val="22"/>
+          <w:szCs w:val="22"/>
+        </w:rPr>
+        <w:t xml:space="preserve">That glass is empty. Somebody fix that immediately.</w:t>
+      </w:r>
+    </w:p>
+    <w:p>
+      <w:pPr>
+        <w:pStyle w:val="ListParagraph"/>
+        <w:numPr>
+          <w:ilvl w:val="0"/>
+          <w:numId w:val="63"/>
+        </w:numPr>
+        <w:spacing w:after="20"/>
+      </w:pPr>
+      <w:r>
+        <w:rPr>
+          <w:sz w:val="22"/>
+          <w:szCs w:val="22"/>
+        </w:rPr>
+        <w:t xml:space="preserve">Whiskey in a glass that small? That's just a tease.</w:t>
+      </w:r>
+    </w:p>
+    <w:p>
+      <w:pPr>
+        <w:pStyle w:val="ListParagraph"/>
+        <w:numPr>
+          <w:ilvl w:val="0"/>
+          <w:numId w:val="63"/>
+        </w:numPr>
+        <w:spacing w:after="20"/>
+      </w:pPr>
+      <w:r>
+        <w:rPr>
+          <w:sz w:val="22"/>
+          <w:szCs w:val="22"/>
+        </w:rPr>
+        <w:t xml:space="preserve">A shot glass on the reels. The night's officially gettin' interesting.</w:t>
+      </w:r>
+    </w:p>
+    <w:p>
+      <w:pPr>
+        <w:pStyle w:val="ListParagraph"/>
+        <w:numPr>
+          <w:ilvl w:val="0"/>
+          <w:numId w:val="63"/>
+        </w:numPr>
+        <w:spacing w:after="20"/>
+      </w:pPr>
+      <w:r>
+        <w:rPr>
+          <w:sz w:val="22"/>
+          <w:szCs w:val="22"/>
+        </w:rPr>
+        <w:t xml:space="preserve">Careful — one glass leads to ten, and ten leads to singin'.</w:t>
+      </w:r>
+    </w:p>
+    <w:p>
+      <w:pPr>
+        <w:pStyle w:val="Heading2"/>
+        <w:spacing w:after="40" w:before="160"/>
+      </w:pPr>
+      <w:r>
+        <w:rPr>
+          <w:b/>
+          <w:bCs/>
+          <w:color w:val="8A6D1A"/>
+          <w:sz w:val="24"/>
+          <w:szCs w:val="24"/>
+        </w:rPr>
+        <w:t xml:space="preserve">Tapping a royal card symbol (A / K / Q / J / 10)</w:t>
+      </w:r>
+      <w:r>
+        <w:rPr>
+          <w:color w:val="666666"/>
+          <w:sz w:val="16"/>
+          <w:szCs w:val="16"/>
+        </w:rPr>
+        <w:t xml:space="preserve">   (clickRoyals · 7)</w:t>
+      </w:r>
+    </w:p>
+    <w:p>
+      <w:pPr>
+        <w:pStyle w:val="ListParagraph"/>
+        <w:numPr>
+          <w:ilvl w:val="0"/>
+          <w:numId w:val="64"/>
+        </w:numPr>
+        <w:spacing w:after="20"/>
+      </w:pPr>
+      <w:r>
+        <w:rPr>
+          <w:sz w:val="22"/>
+          <w:szCs w:val="22"/>
+        </w:rPr>
+        <w:t xml:space="preserve">Playin' cards? In a saloon? Now somebody's definitely cheatin'.</w:t>
+      </w:r>
+    </w:p>
+    <w:p>
+      <w:pPr>
+        <w:pStyle w:val="ListParagraph"/>
+        <w:numPr>
+          <w:ilvl w:val="0"/>
+          <w:numId w:val="64"/>
+        </w:numPr>
+        <w:spacing w:after="20"/>
+      </w:pPr>
+      <w:r>
+        <w:rPr>
+          <w:sz w:val="22"/>
+          <w:szCs w:val="22"/>
+        </w:rPr>
+        <w:t xml:space="preserve">Ace, King, Queen... fancy letters for the low-payin' folks.</w:t>
+      </w:r>
+    </w:p>
+    <w:p>
+      <w:pPr>
+        <w:pStyle w:val="ListParagraph"/>
+        <w:numPr>
+          <w:ilvl w:val="0"/>
+          <w:numId w:val="64"/>
+        </w:numPr>
+        <w:spacing w:after="20"/>
+      </w:pPr>
+      <w:r>
+        <w:rPr>
+          <w:sz w:val="22"/>
+          <w:szCs w:val="22"/>
+        </w:rPr>
+        <w:t xml:space="preserve">Them royals don't pay much. Even the buzzard looks down on 'em.</w:t>
+      </w:r>
+    </w:p>
+    <w:p>
+      <w:pPr>
+        <w:pStyle w:val="ListParagraph"/>
+        <w:numPr>
+          <w:ilvl w:val="0"/>
+          <w:numId w:val="64"/>
+        </w:numPr>
+        <w:spacing w:after="20"/>
+      </w:pPr>
+      <w:r>
+        <w:rPr>
+          <w:sz w:val="22"/>
+          <w:szCs w:val="22"/>
+        </w:rPr>
+        <w:t xml:space="preserve">Last fella who played cards with me left in a real hurry.</w:t>
+      </w:r>
+    </w:p>
+    <w:p>
+      <w:pPr>
+        <w:pStyle w:val="ListParagraph"/>
+        <w:numPr>
+          <w:ilvl w:val="0"/>
+          <w:numId w:val="64"/>
+        </w:numPr>
+        <w:spacing w:after="20"/>
+      </w:pPr>
+      <w:r>
+        <w:rPr>
+          <w:sz w:val="22"/>
+          <w:szCs w:val="22"/>
+        </w:rPr>
+        <w:t xml:space="preserve">A face card. At least it's got a face — unlike that buzzard's personality.</w:t>
+      </w:r>
+    </w:p>
+    <w:p>
+      <w:pPr>
+        <w:pStyle w:val="ListParagraph"/>
+        <w:numPr>
+          <w:ilvl w:val="0"/>
+          <w:numId w:val="64"/>
+        </w:numPr>
+        <w:spacing w:after="20"/>
+      </w:pPr>
+      <w:r>
+        <w:rPr>
+          <w:sz w:val="22"/>
+          <w:szCs w:val="22"/>
+        </w:rPr>
+        <w:t xml:space="preserve">Them letters pay the least, partner. But they sure crowd in.</w:t>
+      </w:r>
+    </w:p>
+    <w:p>
+      <w:pPr>
+        <w:pStyle w:val="ListParagraph"/>
+        <w:numPr>
+          <w:ilvl w:val="0"/>
+          <w:numId w:val="64"/>
+        </w:numPr>
+        <w:spacing w:after="20"/>
+      </w:pPr>
+      <w:r>
+        <w:rPr>
+          <w:sz w:val="22"/>
+          <w:szCs w:val="22"/>
+        </w:rPr>
+        <w:t xml:space="preserve">Queen of hearts? In this town she runs the place. Don't cross her.</w:t>
+      </w:r>
+    </w:p>
+    <w:p>
+      <w:pPr>
+        <w:pStyle w:val="Heading2"/>
+        <w:spacing w:after="40" w:before="160"/>
+      </w:pPr>
+      <w:r>
+        <w:rPr>
+          <w:b/>
+          <w:bCs/>
+          <w:color w:val="8A6D1A"/>
+          <w:sz w:val="24"/>
+          <w:szCs w:val="24"/>
+        </w:rPr>
+        <w:t xml:space="preserve">Tapping the Wolf Wild symbol</w:t>
+      </w:r>
+      <w:r>
+        <w:rPr>
+          <w:color w:val="666666"/>
+          <w:sz w:val="16"/>
+          <w:szCs w:val="16"/>
+        </w:rPr>
+        <w:t xml:space="preserve">   (clickWild · 4)</w:t>
+      </w:r>
+    </w:p>
+    <w:p>
+      <w:pPr>
+        <w:pStyle w:val="ListParagraph"/>
+        <w:numPr>
+          <w:ilvl w:val="0"/>
+          <w:numId w:val="65"/>
+        </w:numPr>
+        <w:spacing w:after="20"/>
+      </w:pPr>
+      <w:r>
+        <w:rPr>
+          <w:sz w:val="22"/>
+          <w:szCs w:val="22"/>
+        </w:rPr>
+        <w:t xml:space="preserve">That's the Wolf Wild — my finest work. Fills the whole reel, like my ego.</w:t>
+      </w:r>
+    </w:p>
+    <w:p>
+      <w:pPr>
+        <w:pStyle w:val="ListParagraph"/>
+        <w:numPr>
+          <w:ilvl w:val="0"/>
+          <w:numId w:val="65"/>
+        </w:numPr>
+        <w:spacing w:after="20"/>
+      </w:pPr>
+      <w:r>
+        <w:rPr>
+          <w:sz w:val="22"/>
+          <w:szCs w:val="22"/>
+        </w:rPr>
+        <w:t xml:space="preserve">The wild's all me, partner. When it lands, the saloon checks the locks.</w:t>
+      </w:r>
+    </w:p>
+    <w:p>
+      <w:pPr>
+        <w:pStyle w:val="ListParagraph"/>
+        <w:numPr>
+          <w:ilvl w:val="0"/>
+          <w:numId w:val="65"/>
+        </w:numPr>
+        <w:spacing w:after="20"/>
+      </w:pPr>
+      <w:r>
+        <w:rPr>
+          <w:sz w:val="22"/>
+          <w:szCs w:val="22"/>
+        </w:rPr>
+        <w:t xml:space="preserve">Click the wild all ya like. It's basically a portrait of yours truly.</w:t>
+      </w:r>
+    </w:p>
+    <w:p>
+      <w:pPr>
+        <w:pStyle w:val="ListParagraph"/>
+        <w:numPr>
+          <w:ilvl w:val="0"/>
+          <w:numId w:val="65"/>
+        </w:numPr>
+        <w:spacing w:after="20"/>
+      </w:pPr>
+      <w:r>
+        <w:rPr>
+          <w:sz w:val="22"/>
+          <w:szCs w:val="22"/>
+        </w:rPr>
+        <w:t xml:space="preserve">That snarl in the middle? Pure wolf. Accept no substitutes — 'cept that one.</w:t>
+      </w:r>
+    </w:p>
+    <w:p>
+      <w:pPr>
+        <w:pStyle w:val="Heading1"/>
+        <w:spacing w:after="120" w:before="280"/>
+      </w:pPr>
+      <w:r>
+        <w:rPr>
+          <w:b/>
+          <w:bCs/>
+          <w:color w:val="1A3A1F"/>
+        </w:rPr>
+        <w:t xml:space="preserve">Friendly roasts — DISABLED by default</w:t>
+      </w:r>
+    </w:p>
+    <w:p>
+      <w:pPr>
+        <w:pStyle w:val="Heading2"/>
+        <w:spacing w:after="40" w:before="160"/>
+      </w:pPr>
+      <w:r>
+        <w:rPr>
+          <w:b/>
+          <w:bCs/>
+          <w:color w:val="8A6D1A"/>
+          <w:sz w:val="24"/>
+          <w:szCs w:val="24"/>
+        </w:rPr>
+        <w:t xml:space="preserve">Tongue-in-cheek nods to the “other” huff-and-puff game. OFF by default; enable only if you want them.</w:t>
+      </w:r>
+      <w:r>
+        <w:rPr>
+          <w:color w:val="666666"/>
+          <w:sz w:val="16"/>
+          <w:szCs w:val="16"/>
+        </w:rPr>
         <w:t xml:space="preserve">   (roasts · 10)</w:t>
       </w:r>
     </w:p>
@@ -10151,7 +11258,7 @@
         <w:pStyle w:val="ListParagraph"/>
         <w:numPr>
           <w:ilvl w:val="0"/>
-          <w:numId w:val="58"/>
+          <w:numId w:val="66"/>
         </w:numPr>
         <w:spacing w:after="20"/>
       </w:pPr>
@@ -10168,7 +11275,7 @@
         <w:pStyle w:val="ListParagraph"/>
         <w:numPr>
           <w:ilvl w:val="0"/>
-          <w:numId w:val="58"/>
+          <w:numId w:val="66"/>
         </w:numPr>
         <w:spacing w:after="20"/>
       </w:pPr>
@@ -10185,7 +11292,7 @@
         <w:pStyle w:val="ListParagraph"/>
         <w:numPr>
           <w:ilvl w:val="0"/>
-          <w:numId w:val="58"/>
+          <w:numId w:val="66"/>
         </w:numPr>
         <w:spacing w:after="20"/>
       </w:pPr>
@@ -10202,7 +11309,7 @@
         <w:pStyle w:val="ListParagraph"/>
         <w:numPr>
           <w:ilvl w:val="0"/>
-          <w:numId w:val="58"/>
+          <w:numId w:val="66"/>
         </w:numPr>
         <w:spacing w:after="20"/>
       </w:pPr>
@@ -10219,7 +11326,7 @@
         <w:pStyle w:val="ListParagraph"/>
         <w:numPr>
           <w:ilvl w:val="0"/>
-          <w:numId w:val="58"/>
+          <w:numId w:val="66"/>
         </w:numPr>
         <w:spacing w:after="20"/>
       </w:pPr>
@@ -10236,7 +11343,7 @@
         <w:pStyle w:val="ListParagraph"/>
         <w:numPr>
           <w:ilvl w:val="0"/>
-          <w:numId w:val="58"/>
+          <w:numId w:val="66"/>
         </w:numPr>
         <w:spacing w:after="20"/>
       </w:pPr>
@@ -10253,7 +11360,7 @@
         <w:pStyle w:val="ListParagraph"/>
         <w:numPr>
           <w:ilvl w:val="0"/>
-          <w:numId w:val="58"/>
+          <w:numId w:val="66"/>
         </w:numPr>
         <w:spacing w:after="20"/>
       </w:pPr>
@@ -10270,7 +11377,7 @@
         <w:pStyle w:val="ListParagraph"/>
         <w:numPr>
           <w:ilvl w:val="0"/>
-          <w:numId w:val="58"/>
+          <w:numId w:val="66"/>
         </w:numPr>
         <w:spacing w:after="20"/>
       </w:pPr>
@@ -10287,7 +11394,7 @@
         <w:pStyle w:val="ListParagraph"/>
         <w:numPr>
           <w:ilvl w:val="0"/>
-          <w:numId w:val="58"/>
+          <w:numId w:val="66"/>
         </w:numPr>
         <w:spacing w:after="20"/>
       </w:pPr>
@@ -10304,7 +11411,7 @@
         <w:pStyle w:val="ListParagraph"/>
         <w:numPr>
           <w:ilvl w:val="0"/>
-          <w:numId w:val="58"/>
+          <w:numId w:val="66"/>
         </w:numPr>
         <w:spacing w:after="20"/>
       </w:pPr>
@@ -11193,6 +12300,102 @@
     </w:lvl>
   </w:abstractNum>
   <w:abstractNum w:abstractNumId="58" w15:restartNumberingAfterBreak="0">
+    <w:multiLevelType w:val="hybridMultilevel"/>
+    <w:lvl w:ilvl="0" w15:tentative="1">
+      <w:start w:val="1"/>
+      <w:numFmt w:val="decimal"/>
+      <w:lvlText w:val="%1."/>
+      <w:lvlJc w:val="left"/>
+      <w:pPr>
+        <w:ind w:left="520" w:hanging="300"/>
+      </w:pPr>
+    </w:lvl>
+  </w:abstractNum>
+  <w:abstractNum w:abstractNumId="59" w15:restartNumberingAfterBreak="0">
+    <w:multiLevelType w:val="hybridMultilevel"/>
+    <w:lvl w:ilvl="0" w15:tentative="1">
+      <w:start w:val="1"/>
+      <w:numFmt w:val="decimal"/>
+      <w:lvlText w:val="%1."/>
+      <w:lvlJc w:val="left"/>
+      <w:pPr>
+        <w:ind w:left="520" w:hanging="300"/>
+      </w:pPr>
+    </w:lvl>
+  </w:abstractNum>
+  <w:abstractNum w:abstractNumId="60" w15:restartNumberingAfterBreak="0">
+    <w:multiLevelType w:val="hybridMultilevel"/>
+    <w:lvl w:ilvl="0" w15:tentative="1">
+      <w:start w:val="1"/>
+      <w:numFmt w:val="decimal"/>
+      <w:lvlText w:val="%1."/>
+      <w:lvlJc w:val="left"/>
+      <w:pPr>
+        <w:ind w:left="520" w:hanging="300"/>
+      </w:pPr>
+    </w:lvl>
+  </w:abstractNum>
+  <w:abstractNum w:abstractNumId="61" w15:restartNumberingAfterBreak="0">
+    <w:multiLevelType w:val="hybridMultilevel"/>
+    <w:lvl w:ilvl="0" w15:tentative="1">
+      <w:start w:val="1"/>
+      <w:numFmt w:val="decimal"/>
+      <w:lvlText w:val="%1."/>
+      <w:lvlJc w:val="left"/>
+      <w:pPr>
+        <w:ind w:left="520" w:hanging="300"/>
+      </w:pPr>
+    </w:lvl>
+  </w:abstractNum>
+  <w:abstractNum w:abstractNumId="62" w15:restartNumberingAfterBreak="0">
+    <w:multiLevelType w:val="hybridMultilevel"/>
+    <w:lvl w:ilvl="0" w15:tentative="1">
+      <w:start w:val="1"/>
+      <w:numFmt w:val="decimal"/>
+      <w:lvlText w:val="%1."/>
+      <w:lvlJc w:val="left"/>
+      <w:pPr>
+        <w:ind w:left="520" w:hanging="300"/>
+      </w:pPr>
+    </w:lvl>
+  </w:abstractNum>
+  <w:abstractNum w:abstractNumId="63" w15:restartNumberingAfterBreak="0">
+    <w:multiLevelType w:val="hybridMultilevel"/>
+    <w:lvl w:ilvl="0" w15:tentative="1">
+      <w:start w:val="1"/>
+      <w:numFmt w:val="decimal"/>
+      <w:lvlText w:val="%1."/>
+      <w:lvlJc w:val="left"/>
+      <w:pPr>
+        <w:ind w:left="520" w:hanging="300"/>
+      </w:pPr>
+    </w:lvl>
+  </w:abstractNum>
+  <w:abstractNum w:abstractNumId="64" w15:restartNumberingAfterBreak="0">
+    <w:multiLevelType w:val="hybridMultilevel"/>
+    <w:lvl w:ilvl="0" w15:tentative="1">
+      <w:start w:val="1"/>
+      <w:numFmt w:val="decimal"/>
+      <w:lvlText w:val="%1."/>
+      <w:lvlJc w:val="left"/>
+      <w:pPr>
+        <w:ind w:left="520" w:hanging="300"/>
+      </w:pPr>
+    </w:lvl>
+  </w:abstractNum>
+  <w:abstractNum w:abstractNumId="65" w15:restartNumberingAfterBreak="0">
+    <w:multiLevelType w:val="hybridMultilevel"/>
+    <w:lvl w:ilvl="0" w15:tentative="1">
+      <w:start w:val="1"/>
+      <w:numFmt w:val="decimal"/>
+      <w:lvlText w:val="%1."/>
+      <w:lvlJc w:val="left"/>
+      <w:pPr>
+        <w:ind w:left="520" w:hanging="300"/>
+      </w:pPr>
+    </w:lvl>
+  </w:abstractNum>
+  <w:abstractNum w:abstractNumId="66" w15:restartNumberingAfterBreak="0">
     <w:multiLevelType w:val="hybridMultilevel"/>
     <w:lvl w:ilvl="0" w15:tentative="1">
       <w:start w:val="1"/>
@@ -11552,6 +12755,54 @@
       <w:startOverride w:val="1"/>
     </w:lvlOverride>
   </w:num>
+  <w:num w:numId="59">
+    <w:abstractNumId w:val="59"/>
+    <w:lvlOverride w:ilvl="0">
+      <w:startOverride w:val="1"/>
+    </w:lvlOverride>
+  </w:num>
+  <w:num w:numId="60">
+    <w:abstractNumId w:val="60"/>
+    <w:lvlOverride w:ilvl="0">
+      <w:startOverride w:val="1"/>
+    </w:lvlOverride>
+  </w:num>
+  <w:num w:numId="61">
+    <w:abstractNumId w:val="61"/>
+    <w:lvlOverride w:ilvl="0">
+      <w:startOverride w:val="1"/>
+    </w:lvlOverride>
+  </w:num>
+  <w:num w:numId="62">
+    <w:abstractNumId w:val="62"/>
+    <w:lvlOverride w:ilvl="0">
+      <w:startOverride w:val="1"/>
+    </w:lvlOverride>
+  </w:num>
+  <w:num w:numId="63">
+    <w:abstractNumId w:val="63"/>
+    <w:lvlOverride w:ilvl="0">
+      <w:startOverride w:val="1"/>
+    </w:lvlOverride>
+  </w:num>
+  <w:num w:numId="64">
+    <w:abstractNumId w:val="64"/>
+    <w:lvlOverride w:ilvl="0">
+      <w:startOverride w:val="1"/>
+    </w:lvlOverride>
+  </w:num>
+  <w:num w:numId="65">
+    <w:abstractNumId w:val="65"/>
+    <w:lvlOverride w:ilvl="0">
+      <w:startOverride w:val="1"/>
+    </w:lvlOverride>
+  </w:num>
+  <w:num w:numId="66">
+    <w:abstractNumId w:val="66"/>
+    <w:lvlOverride w:ilvl="0">
+      <w:startOverride w:val="1"/>
+    </w:lvlOverride>
+  </w:num>
 </w:numbering>
 </file>
 

</xml_diff>